<commit_message>
Update: Add Certification SQL
</commit_message>
<xml_diff>
--- a/resume/Elmar_Leonard_CV.docx
+++ b/resume/Elmar_Leonard_CV.docx
@@ -7,15 +7,18 @@
         <w:pStyle w:val="normal1"/>
         <w:spacing w:lineRule="auto" w:line="240" w:before="0" w:after="20"/>
         <w:jc w:val="center"/>
-        <w:rPr/>
-      </w:pPr>
-      <w:r>
-        <w:rPr>
-          <w:rFonts w:eastAsia="Calibri" w:cs="Calibri"/>
-          <w:b/>
-          <w:bCs/>
-          <w:sz w:val="34"/>
-          <w:szCs w:val="34"/>
+        <w:rPr>
+          <w:sz w:val="32"/>
+          <w:szCs w:val="32"/>
+        </w:rPr>
+      </w:pPr>
+      <w:r>
+        <w:rPr>
+          <w:rFonts w:eastAsia="Calibri" w:cs="Calibri"/>
+          <w:b/>
+          <w:bCs/>
+          <w:sz w:val="32"/>
+          <w:szCs w:val="32"/>
         </w:rPr>
         <w:t>Elmar Leonard</w:t>
       </w:r>
@@ -33,7 +36,7 @@
           <w:sz w:val="23"/>
           <w:szCs w:val="23"/>
         </w:rPr>
-        <w:t>Junior Data Scientist, Data Analyst, Data Engineer &amp; Business Analyst</w:t>
+        <w:t>Junior Data Scientist | Data Analyst | Data Engineer | Business Analyst</w:t>
       </w:r>
     </w:p>
     <w:p>
@@ -140,19 +143,20 @@
     </w:p>
     <w:p>
       <w:pPr>
-        <w:pStyle w:val="normal1"/>
+        <w:pStyle w:val="Heading1"/>
         <w:keepNext w:val="true"/>
         <w:pBdr>
           <w:bottom w:val="single" w:sz="4" w:space="1" w:color="808080"/>
         </w:pBdr>
-        <w:spacing w:lineRule="auto" w:line="240" w:before="200" w:after="80"/>
-        <w:rPr/>
-      </w:pPr>
-      <w:r>
-        <w:rPr>
-          <w:rFonts w:eastAsia="Calibri" w:cs="Calibri"/>
-          <w:b/>
-          <w:bCs/>
+        <w:spacing w:lineRule="auto" w:line="240" w:before="160" w:after="80"/>
+        <w:rPr/>
+      </w:pPr>
+      <w:r>
+        <w:rPr>
+          <w:rFonts w:eastAsia="Calibri" w:cs="Calibri"/>
+          <w:b/>
+          <w:bCs/>
+          <w:color w:val="auto"/>
           <w:sz w:val="22"/>
           <w:szCs w:val="22"/>
         </w:rPr>
@@ -162,7 +166,7 @@
     <w:p>
       <w:pPr>
         <w:pStyle w:val="normal1"/>
-        <w:spacing w:lineRule="auto" w:line="240" w:before="0" w:after="20"/>
+        <w:spacing w:lineRule="auto" w:line="240" w:before="0" w:after="0"/>
         <w:rPr>
           <w:rFonts w:ascii="Calibri" w:hAnsi="Calibri" w:eastAsia="Calibri" w:cs="Calibri"/>
           <w:sz w:val="21"/>
@@ -181,27 +185,37 @@
     <w:p>
       <w:pPr>
         <w:pStyle w:val="normal1"/>
-        <w:spacing w:lineRule="auto" w:line="240" w:before="0" w:after="20"/>
-        <w:rPr/>
-      </w:pPr>
-      <w:r>
-        <w:rPr/>
-      </w:r>
-    </w:p>
-    <w:p>
-      <w:pPr>
-        <w:pStyle w:val="normal1"/>
+        <w:spacing w:lineRule="auto" w:line="240" w:before="0" w:after="0"/>
+        <w:rPr>
+          <w:rFonts w:ascii="Calibri" w:hAnsi="Calibri" w:eastAsia="Calibri" w:cs="Calibri"/>
+          <w:sz w:val="21"/>
+          <w:szCs w:val="21"/>
+        </w:rPr>
+      </w:pPr>
+      <w:r>
+        <w:rPr>
+          <w:rFonts w:eastAsia="Calibri" w:cs="Calibri"/>
+          <w:sz w:val="21"/>
+          <w:szCs w:val="21"/>
+        </w:rPr>
+      </w:r>
+    </w:p>
+    <w:p>
+      <w:pPr>
+        <w:pStyle w:val="Heading1"/>
         <w:keepNext w:val="true"/>
         <w:pBdr>
           <w:bottom w:val="single" w:sz="4" w:space="1" w:color="808080"/>
         </w:pBdr>
-        <w:spacing w:lineRule="auto" w:line="240" w:before="200" w:after="80"/>
-        <w:rPr/>
-      </w:pPr>
-      <w:r>
-        <w:rPr>
-          <w:b/>
-          <w:bCs/>
+        <w:spacing w:lineRule="auto" w:line="240" w:before="160" w:after="80"/>
+        <w:rPr/>
+      </w:pPr>
+      <w:r>
+        <w:rPr>
+          <w:rFonts w:eastAsia="Calibri" w:cs="Calibri"/>
+          <w:b/>
+          <w:bCs/>
+          <w:color w:val="auto"/>
           <w:sz w:val="22"/>
           <w:szCs w:val="22"/>
         </w:rPr>
@@ -223,7 +237,7 @@
       </w:r>
       <w:r>
         <w:rPr/>
-        <w:t xml:space="preserve">Python, SQL (MySQL), pandas, NumPy, SciPy, scikit-learn, Data Cleaning &amp; Wrangling, Exploratory Data Analysis (EDA), Statistical Analysis, Hypothesis Testing (ANOVA, Welch's t-test), Machine Learning (Classification, Regression, Unsupervised, Supervised), Predictive Modeling, Gradient Boosting, Model Evaluation, Threshold Tuning, Data Visualization (Matplotlib, Seaborn), Dashboard Development, Web Scraping, Process Automation, ETL, Data Pipeline, Web Scraping, Process Automation, Dashboard Reporting   </w:t>
+        <w:t xml:space="preserve">Python, SQL (MySQL), pandas, NumPy, SciPy, scikit-learn, Data Cleaning &amp; Wrangling, Exploratory Data Analysis (EDA), Statistical Analysis, Hypothesis Testing (ANOVA, Welch's t-test), Machine Learning (Classification, Regression, Unsupervised, Supervised), Predictive Modeling, Gradient Boosting, Model Evaluation, Threshold Tuning, Data Visualization (Matplotlib, Seaborn), Dashboard Development, Web Scraping, Process Automation, ETL, Data Pipeline, Data Validation, Dashboard Reporting</w:t>
       </w:r>
     </w:p>
     <w:p>
@@ -241,7 +255,7 @@
       </w:r>
       <w:r>
         <w:rPr/>
-        <w:t>Tableau, Streamlit, Microsoft Excel, Selenium, Git, GitHub</w:t>
+        <w:t>Tableau, Streamlit, Microsoft Excel, Selenium, Requests, BeautifulSoup, PyMySQL, Git, GitHub</w:t>
       </w:r>
     </w:p>
     <w:p>
@@ -292,19 +306,20 @@
     </w:p>
     <w:p>
       <w:pPr>
-        <w:pStyle w:val="normal1"/>
+        <w:pStyle w:val="Heading1"/>
         <w:keepNext w:val="true"/>
         <w:pBdr>
           <w:bottom w:val="single" w:sz="4" w:space="1" w:color="808080"/>
         </w:pBdr>
-        <w:spacing w:lineRule="auto" w:line="240" w:before="200" w:after="80"/>
-        <w:rPr/>
-      </w:pPr>
-      <w:r>
-        <w:rPr>
-          <w:rFonts w:eastAsia="Calibri" w:cs="Calibri"/>
-          <w:b/>
-          <w:bCs/>
+        <w:spacing w:lineRule="auto" w:line="240" w:before="160" w:after="80"/>
+        <w:rPr/>
+      </w:pPr>
+      <w:r>
+        <w:rPr>
+          <w:rFonts w:eastAsia="Calibri" w:cs="Calibri"/>
+          <w:b/>
+          <w:bCs/>
+          <w:color w:val="auto"/>
           <w:sz w:val="22"/>
           <w:szCs w:val="22"/>
         </w:rPr>
@@ -566,23 +581,6 @@
     <w:p>
       <w:pPr>
         <w:pStyle w:val="normal1"/>
-        <w:keepNext w:val="false"/>
-        <w:keepLines w:val="false"/>
-        <w:pageBreakBefore w:val="false"/>
-        <w:widowControl/>
-        <w:shd w:val="clear" w:fill="auto"/>
-        <w:spacing w:lineRule="auto" w:line="240" w:before="0" w:after="20"/>
-        <w:ind w:hanging="0" w:start="360" w:end="0"/>
-        <w:jc w:val="start"/>
-        <w:rPr/>
-      </w:pPr>
-      <w:r>
-        <w:rPr/>
-      </w:r>
-    </w:p>
-    <w:p>
-      <w:pPr>
-        <w:pStyle w:val="normal1"/>
         <w:keepNext w:val="true"/>
         <w:tabs>
           <w:tab w:val="clear" w:pos="720"/>
@@ -796,24 +794,6 @@
     <w:p>
       <w:pPr>
         <w:pStyle w:val="normal1"/>
-        <w:widowControl/>
-        <w:numPr>
-          <w:ilvl w:val="0"/>
-          <w:numId w:val="0"/>
-        </w:numPr>
-        <w:shd w:val="clear" w:fill="auto"/>
-        <w:spacing w:lineRule="auto" w:line="240" w:before="0" w:after="20"/>
-        <w:ind w:hanging="0" w:start="360" w:end="0"/>
-        <w:jc w:val="start"/>
-        <w:rPr/>
-      </w:pPr>
-      <w:r>
-        <w:rPr/>
-      </w:r>
-    </w:p>
-    <w:p>
-      <w:pPr>
-        <w:pStyle w:val="normal1"/>
         <w:keepNext w:val="true"/>
         <w:tabs>
           <w:tab w:val="clear" w:pos="720"/>
@@ -1009,17 +989,6 @@
     <w:p>
       <w:pPr>
         <w:pStyle w:val="normal1"/>
-        <w:spacing w:lineRule="auto" w:line="240" w:before="0" w:after="20"/>
-        <w:ind w:hanging="0" w:start="360"/>
-        <w:rPr/>
-      </w:pPr>
-      <w:r>
-        <w:rPr/>
-      </w:r>
-    </w:p>
-    <w:p>
-      <w:pPr>
-        <w:pStyle w:val="normal1"/>
         <w:keepNext w:val="true"/>
         <w:tabs>
           <w:tab w:val="clear" w:pos="720"/>
@@ -1174,10 +1143,11 @@
     <w:p>
       <w:pPr>
         <w:pStyle w:val="normal1"/>
-        <w:keepNext w:val="false"/>
-        <w:keepLines w:val="false"/>
-        <w:pageBreakBefore w:val="false"/>
         <w:widowControl/>
+        <w:numPr>
+          <w:ilvl w:val="0"/>
+          <w:numId w:val="0"/>
+        </w:numPr>
         <w:shd w:val="clear" w:fill="auto"/>
         <w:spacing w:lineRule="auto" w:line="240" w:before="0" w:after="20"/>
         <w:ind w:hanging="0" w:start="360" w:end="0"/>
@@ -1190,19 +1160,20 @@
     </w:p>
     <w:p>
       <w:pPr>
-        <w:pStyle w:val="normal1"/>
+        <w:pStyle w:val="Heading1"/>
         <w:keepNext w:val="true"/>
         <w:pBdr>
           <w:bottom w:val="single" w:sz="4" w:space="1" w:color="808080"/>
         </w:pBdr>
-        <w:spacing w:lineRule="auto" w:line="240" w:before="200" w:after="80"/>
-        <w:rPr/>
-      </w:pPr>
-      <w:r>
-        <w:rPr>
-          <w:rFonts w:eastAsia="Calibri" w:cs="Calibri"/>
-          <w:b/>
-          <w:bCs/>
+        <w:spacing w:lineRule="auto" w:line="240" w:before="160" w:after="80"/>
+        <w:rPr/>
+      </w:pPr>
+      <w:r>
+        <w:rPr>
+          <w:rFonts w:eastAsia="Calibri" w:cs="Calibri"/>
+          <w:b/>
+          <w:bCs/>
+          <w:color w:val="auto"/>
           <w:sz w:val="22"/>
           <w:szCs w:val="22"/>
         </w:rPr>
@@ -1228,7 +1199,7 @@
           <w:sz w:val="21"/>
           <w:szCs w:val="21"/>
         </w:rPr>
-        <w:t>Data Associate (Contract),  Ministry of Health of Indonesia, Central Jakarta</w:t>
+        <w:t>Data Associate (Contract), Ministry of Health of Indonesia, Central Jakarta</w:t>
         <w:tab/>
       </w:r>
       <w:r>
@@ -1355,9 +1326,6 @@
         <w:spacing w:lineRule="auto" w:line="240" w:before="0" w:after="20"/>
         <w:ind w:hanging="260" w:start="360" w:end="0"/>
         <w:jc w:val="start"/>
-        <w:rPr/>
-      </w:pPr>
-      <w:r>
         <w:rPr>
           <w:rFonts w:eastAsia="Calibri" w:cs="Calibri"/>
           <w:b w:val="false"/>
@@ -1376,41 +1344,93 @@
           <w:shd w:fill="auto" w:val="clear"/>
           <w:vertAlign w:val="baseline"/>
         </w:rPr>
+      </w:pPr>
+      <w:r>
+        <w:rPr>
+          <w:rFonts w:eastAsia="Calibri" w:cs="Calibri"/>
+          <w:b w:val="false"/>
+          <w:bCs w:val="false"/>
+          <w:i w:val="false"/>
+          <w:iCs w:val="false"/>
+          <w:caps w:val="false"/>
+          <w:smallCaps w:val="false"/>
+          <w:strike w:val="false"/>
+          <w:dstrike w:val="false"/>
+          <w:color w:val="000000"/>
+          <w:position w:val="0"/>
+          <w:sz w:val="21"/>
+          <w:szCs w:val="21"/>
+          <w:u w:val="none"/>
+          <w:shd w:fill="auto" w:val="clear"/>
+          <w:vertAlign w:val="baseline"/>
+        </w:rPr>
         <w:t>Implemented script-based validation to verify data accuracy across the entered records.</w:t>
       </w:r>
     </w:p>
     <w:p>
       <w:pPr>
         <w:pStyle w:val="normal1"/>
-        <w:keepNext w:val="false"/>
-        <w:keepLines w:val="false"/>
-        <w:pageBreakBefore w:val="false"/>
         <w:widowControl/>
+        <w:numPr>
+          <w:ilvl w:val="0"/>
+          <w:numId w:val="0"/>
+        </w:numPr>
         <w:shd w:val="clear" w:fill="auto"/>
         <w:spacing w:lineRule="auto" w:line="240" w:before="0" w:after="20"/>
         <w:ind w:hanging="0" w:start="360" w:end="0"/>
         <w:jc w:val="start"/>
-        <w:rPr/>
-      </w:pPr>
-      <w:r>
-        <w:rPr/>
-      </w:r>
-    </w:p>
-    <w:p>
-      <w:pPr>
-        <w:pStyle w:val="normal1"/>
+        <w:rPr>
+          <w:rFonts w:eastAsia="Calibri" w:cs="Calibri"/>
+          <w:b w:val="false"/>
+          <w:bCs w:val="false"/>
+          <w:i w:val="false"/>
+          <w:iCs w:val="false"/>
+          <w:caps w:val="false"/>
+          <w:smallCaps w:val="false"/>
+          <w:strike w:val="false"/>
+          <w:dstrike w:val="false"/>
+          <w:color w:val="000000"/>
+          <w:sz w:val="21"/>
+          <w:szCs w:val="21"/>
+          <w:u w:val="none"/>
+          <w:shd w:fill="auto" w:val="clear"/>
+        </w:rPr>
+      </w:pPr>
+      <w:r>
+        <w:rPr>
+          <w:rFonts w:eastAsia="Calibri" w:cs="Calibri"/>
+          <w:b w:val="false"/>
+          <w:bCs w:val="false"/>
+          <w:i w:val="false"/>
+          <w:iCs w:val="false"/>
+          <w:caps w:val="false"/>
+          <w:smallCaps w:val="false"/>
+          <w:strike w:val="false"/>
+          <w:dstrike w:val="false"/>
+          <w:color w:val="000000"/>
+          <w:sz w:val="21"/>
+          <w:szCs w:val="21"/>
+          <w:u w:val="none"/>
+          <w:shd w:fill="auto" w:val="clear"/>
+        </w:rPr>
+      </w:r>
+    </w:p>
+    <w:p>
+      <w:pPr>
+        <w:pStyle w:val="Heading1"/>
         <w:keepNext w:val="true"/>
         <w:pBdr>
           <w:bottom w:val="single" w:sz="4" w:space="1" w:color="808080"/>
         </w:pBdr>
-        <w:spacing w:lineRule="auto" w:line="240" w:before="200" w:after="80"/>
-        <w:rPr/>
-      </w:pPr>
-      <w:r>
-        <w:rPr>
-          <w:rFonts w:eastAsia="Calibri" w:cs="Calibri"/>
-          <w:b/>
-          <w:bCs/>
+        <w:spacing w:lineRule="auto" w:line="240" w:before="160" w:after="80"/>
+        <w:rPr/>
+      </w:pPr>
+      <w:r>
+        <w:rPr>
+          <w:rFonts w:eastAsia="Calibri" w:cs="Calibri"/>
+          <w:b/>
+          <w:bCs/>
+          <w:color w:val="auto"/>
           <w:sz w:val="22"/>
           <w:szCs w:val="22"/>
         </w:rPr>
@@ -1482,7 +1502,7 @@
           <w:sz w:val="21"/>
           <w:szCs w:val="21"/>
         </w:rPr>
-        <w:t xml:space="preserve">Diponegoro University </w:t>
+        <w:t xml:space="preserve">Bachelor of Computer Engineering, Diponegoro University </w:t>
         <w:tab/>
       </w:r>
       <w:r>
@@ -1510,33 +1530,28 @@
           <w:sz w:val="21"/>
           <w:szCs w:val="21"/>
         </w:rPr>
-        <w:t>Bachelor of Computer Engineering, GPA 3.73/4.00</w:t>
-      </w:r>
-    </w:p>
-    <w:p>
-      <w:pPr>
-        <w:pStyle w:val="normal1"/>
+        <w:t>GPA 3.73/4.00</w:t>
+      </w:r>
+    </w:p>
+    <w:p>
+      <w:pPr>
+        <w:pStyle w:val="Heading1"/>
         <w:keepNext w:val="true"/>
         <w:pBdr>
           <w:bottom w:val="single" w:sz="4" w:space="1" w:color="808080"/>
         </w:pBdr>
-        <w:spacing w:lineRule="auto" w:line="240" w:before="200" w:after="80"/>
-        <w:rPr>
-          <w:rFonts w:eastAsia="Calibri" w:cs="Calibri"/>
-          <w:b/>
-          <w:bCs/>
+        <w:spacing w:lineRule="auto" w:line="240" w:before="160" w:after="80"/>
+        <w:rPr/>
+      </w:pPr>
+      <w:r>
+        <w:rPr>
+          <w:rFonts w:eastAsia="Calibri" w:cs="Calibri"/>
+          <w:b/>
+          <w:bCs/>
+          <w:color w:val="auto"/>
           <w:sz w:val="22"/>
           <w:szCs w:val="22"/>
         </w:rPr>
-      </w:pPr>
-      <w:r>
-        <w:rPr>
-          <w:rFonts w:eastAsia="Calibri" w:cs="Calibri"/>
-          <w:b/>
-          <w:bCs/>
-          <w:sz w:val="22"/>
-          <w:szCs w:val="22"/>
-        </w:rPr>
         <w:t>CERTIFICATIONS</w:t>
       </w:r>
     </w:p>
@@ -1574,30 +1589,56 @@
     <w:p>
       <w:pPr>
         <w:pStyle w:val="normal1"/>
-        <w:keepNext w:val="true"/>
         <w:tabs>
           <w:tab w:val="clear" w:pos="720"/>
           <w:tab w:val="right" w:pos="9638" w:leader="none"/>
         </w:tabs>
-        <w:spacing w:lineRule="auto" w:line="240" w:before="0" w:after="20"/>
-        <w:rPr/>
-      </w:pPr>
-      <w:r>
-        <w:rPr>
-          <w:b/>
-          <w:bCs/>
-        </w:rPr>
-        <w:t>Building Personal Image, Innergy Personality &amp; Communication</w:t>
-      </w:r>
-      <w:r>
-        <w:rPr>
-          <w:rFonts w:eastAsia="Calibri" w:cs="Calibri"/>
-          <w:b/>
-          <w:bCs/>
+        <w:spacing w:lineRule="auto" w:line="240" w:before="114" w:after="134"/>
+        <w:rPr>
+          <w:rFonts w:eastAsia="Calibri" w:cs="Calibri"/>
+          <w:sz w:val="21"/>
+          <w:szCs w:val="21"/>
+        </w:rPr>
+      </w:pPr>
+      <w:r>
+        <w:rPr>
+          <w:rFonts w:eastAsia="Calibri" w:cs="Calibri"/>
+          <w:b/>
+          <w:bCs/>
+          <w:sz w:val="21"/>
+          <w:szCs w:val="21"/>
+        </w:rPr>
+        <w:t>SQL (Advanced), HackerRank</w:t>
+      </w:r>
+      <w:r>
+        <w:rPr>
+          <w:rFonts w:eastAsia="Calibri" w:cs="Calibri"/>
           <w:sz w:val="21"/>
           <w:szCs w:val="21"/>
         </w:rPr>
         <w:tab/>
+        <w:t>Oct 2026</w:t>
+      </w:r>
+    </w:p>
+    <w:p>
+      <w:pPr>
+        <w:pStyle w:val="normal1"/>
+        <w:tabs>
+          <w:tab w:val="clear" w:pos="720"/>
+          <w:tab w:val="right" w:pos="9638" w:leader="none"/>
+        </w:tabs>
+        <w:spacing w:lineRule="auto" w:line="240" w:before="114" w:after="134"/>
+        <w:rPr/>
+      </w:pPr>
+      <w:r>
+        <w:rPr>
+          <w:rFonts w:eastAsia="Calibri" w:cs="Calibri"/>
+          <w:b/>
+          <w:bCs/>
+          <w:sz w:val="21"/>
+          <w:szCs w:val="21"/>
+        </w:rPr>
+        <w:t xml:space="preserve">Credential: </w:t>
       </w:r>
       <w:r>
         <w:rPr>
@@ -1607,23 +1648,49 @@
           <w:sz w:val="21"/>
           <w:szCs w:val="21"/>
         </w:rPr>
-        <w:t>May 2026</w:t>
-      </w:r>
-    </w:p>
-    <w:p>
-      <w:pPr>
-        <w:pStyle w:val="normal1"/>
-        <w:rPr/>
-      </w:pPr>
-      <w:r>
-        <w:rPr>
-          <w:rFonts w:eastAsia="Calibri" w:cs="Calibri"/>
-          <w:b/>
-          <w:bCs/>
-          <w:sz w:val="21"/>
-          <w:szCs w:val="21"/>
-        </w:rPr>
-        <w:t xml:space="preserve">Credential: </w:t>
+        <w:t xml:space="preserve"> </w:t>
+      </w:r>
+      <w:hyperlink r:id="rId15">
+        <w:r>
+          <w:rPr>
+            <w:rStyle w:val="Hyperlink"/>
+            <w:rFonts w:eastAsia="Calibri" w:cs="Calibri"/>
+            <w:b w:val="false"/>
+            <w:bCs w:val="false"/>
+            <w:sz w:val="21"/>
+            <w:szCs w:val="21"/>
+          </w:rPr>
+          <w:t>https://www.hackerrank.com/certificates/3ca99c11c7a4</w:t>
+        </w:r>
+      </w:hyperlink>
+    </w:p>
+    <w:p>
+      <w:pPr>
+        <w:pStyle w:val="normal1"/>
+        <w:keepNext w:val="true"/>
+        <w:tabs>
+          <w:tab w:val="clear" w:pos="720"/>
+          <w:tab w:val="right" w:pos="9638" w:leader="none"/>
+        </w:tabs>
+        <w:spacing w:lineRule="auto" w:line="240" w:before="0" w:after="20"/>
+        <w:rPr/>
+      </w:pPr>
+      <w:r>
+        <w:rPr>
+          <w:b/>
+          <w:bCs/>
+        </w:rPr>
+        <w:t>Building Personal Image, Innergy Personality &amp; Communication</w:t>
+      </w:r>
+      <w:r>
+        <w:rPr>
+          <w:rFonts w:eastAsia="Calibri" w:cs="Calibri"/>
+          <w:b/>
+          <w:bCs/>
+          <w:sz w:val="21"/>
+          <w:szCs w:val="21"/>
+        </w:rPr>
+        <w:tab/>
       </w:r>
       <w:r>
         <w:rPr>
@@ -1633,9 +1700,35 @@
           <w:sz w:val="21"/>
           <w:szCs w:val="21"/>
         </w:rPr>
+        <w:t>May 2026</w:t>
+      </w:r>
+    </w:p>
+    <w:p>
+      <w:pPr>
+        <w:pStyle w:val="normal1"/>
+        <w:rPr/>
+      </w:pPr>
+      <w:r>
+        <w:rPr>
+          <w:rFonts w:eastAsia="Calibri" w:cs="Calibri"/>
+          <w:b/>
+          <w:bCs/>
+          <w:sz w:val="21"/>
+          <w:szCs w:val="21"/>
+        </w:rPr>
+        <w:t xml:space="preserve">Credential: </w:t>
+      </w:r>
+      <w:r>
+        <w:rPr>
+          <w:rFonts w:eastAsia="Calibri" w:cs="Calibri"/>
+          <w:b w:val="false"/>
+          <w:bCs w:val="false"/>
+          <w:sz w:val="21"/>
+          <w:szCs w:val="21"/>
+        </w:rPr>
         <w:t xml:space="preserve"> </w:t>
       </w:r>
-      <w:hyperlink r:id="rId15">
+      <w:hyperlink r:id="rId16">
         <w:r>
           <w:rPr>
             <w:rStyle w:val="Hyperlink"/>
@@ -1647,7 +1740,7 @@
     <w:sectPr>
       <w:type w:val="nextPage"/>
       <w:pgSz w:w="11906" w:h="16838"/>
-      <w:pgMar w:left="1134" w:right="1134" w:gutter="0" w:header="0" w:top="1134" w:footer="0" w:bottom="1134"/>
+      <w:pgMar w:left="1134" w:right="1134" w:gutter="0" w:header="0" w:top="964" w:footer="0" w:bottom="964"/>
       <w:pgNumType w:start="1" w:fmt="decimal"/>
       <w:formProt w:val="false"/>
       <w:textDirection w:val="lrTb"/>
@@ -2170,6 +2263,11 @@
       <w:color w:val="000080"/>
       <w:u w:val="single"/>
     </w:rPr>
+  </w:style>
+  <w:style w:type="character" w:styleId="NumberingSymbols">
+    <w:name w:val="Numbering Symbols"/>
+    <w:qFormat/>
+    <w:rPr/>
   </w:style>
   <w:style w:type="paragraph" w:styleId="Heading">
     <w:name w:val="Heading"/>

</xml_diff>